<commit_message>
docs(gpt4): synchronize seven-agent orchestration and migration guides
</commit_message>
<xml_diff>
--- a/knowledge/gpt4/LINKOTEQ_GPT4_ORCHESTRATOR_GUIDE.docx
+++ b/knowledge/gpt4/LINKOTEQ_GPT4_ORCHESTRATOR_GUIDE.docx
@@ -16,11 +16,6 @@
       </w:r>
     </w:p>
     <w:p>
-      <w:r>
-        <w:br w:type="page"/>
-      </w:r>
-    </w:p>
-    <w:p>
       <w:pPr>
         <w:pStyle w:val="Heading1"/>
       </w:pPr>
@@ -51,7 +46,7 @@
     </w:p>
     <w:p>
       <w:r>
-        <w:t>You sit above GPT-1, GPT-2, and GPT-3:</w:t>
+        <w:t>You coordinate GPT-1 through GPT-7 while each specialist retains authoritative ownership:</w:t>
       </w:r>
     </w:p>
     <w:p>
@@ -88,6 +83,30 @@
     </w:p>
     <w:p>
       <w:pPr>
+        <w:pStyle w:val="ListBullet"/>
+      </w:pPr>
+      <w:r>
+        <w:t>GPT-5 owns independent security review, threat modeling, findings, severity, remediation validation and retest; it does not replace engineering acceptance.</w:t>
+      </w:r>
+    </w:p>
+    <w:p>
+      <w:pPr>
+        <w:pStyle w:val="ListBullet"/>
+      </w:pPr>
+      <w:r>
+        <w:t>GPT-6 owns drawing reconstruction, scale calibration, coordinate transforms, topology, provenance, human review and promotion of eligible geometry to canonical Core models.</w:t>
+      </w:r>
+    </w:p>
+    <w:p>
+      <w:pPr>
+        <w:pStyle w:val="ListBullet"/>
+      </w:pPr>
+      <w:r>
+        <w:t>GPT-7 owns AI detection evidence, datasets, labeling, training, evaluation, model registry, inference versions and detection-quality monitoring; it does not approve structural geometry or calculations.</w:t>
+      </w:r>
+    </w:p>
+    <w:p>
+      <w:pPr>
         <w:pStyle w:val="Heading2"/>
       </w:pPr>
       <w:r>
@@ -178,7 +197,7 @@
         <w:pStyle w:val="ListBullet"/>
       </w:pPr>
       <w:r>
-        <w:t>files prepared for GPT-1/2/3</w:t>
+        <w:t>files prepared for GPT-1 through GPT-7</w:t>
       </w:r>
     </w:p>
     <w:p>
@@ -211,7 +230,7 @@
     </w:p>
     <w:p>
       <w:r>
-        <w:t>User &lt;-&gt; GPT-4 &lt;-&gt; GitHub &lt;-&gt; GPT-1 / GPT-2 / GPT-3</w:t>
+        <w:t>User &lt;-&gt; GPT-4 &lt;-&gt; GitHub &lt;-&gt; GPT-1 / GPT-2 / GPT-3 / GPT-5 / GPT-6 / GPT-7</w:t>
       </w:r>
     </w:p>
     <w:p>
@@ -231,7 +250,17 @@
     </w:p>
     <w:p>
       <w:r>
-        <w:t>2. read `project-status.json` when available;</w:t>
+        <w:t xml:space="preserve">2. read </w:t>
+      </w:r>
+      <w:r>
+        <w:rPr>
+          <w:rFonts w:ascii="Consolas" w:hAnsi="Consolas"/>
+          <w:sz w:val="18"/>
+        </w:rPr>
+        <w:t>project-status.json</w:t>
+      </w:r>
+      <w:r>
+        <w:t xml:space="preserve"> when available;</w:t>
       </w:r>
     </w:p>
     <w:p>
@@ -311,7 +340,17 @@
         <w:pStyle w:val="ListBullet"/>
       </w:pPr>
       <w:r>
-        <w:t>the latest released `linkoteq-structural-core` repository is authoritative for cross-product integration.</w:t>
+        <w:t xml:space="preserve">the latest released </w:t>
+      </w:r>
+      <w:r>
+        <w:rPr>
+          <w:rFonts w:ascii="Consolas" w:hAnsi="Consolas"/>
+          <w:sz w:val="18"/>
+        </w:rPr>
+        <w:t>linkoteq-structural-core</w:t>
+      </w:r>
+      <w:r>
+        <w:t xml:space="preserve"> repository is authoritative for cross-product integration.</w:t>
       </w:r>
     </w:p>
     <w:p>
@@ -324,7 +363,17 @@
     </w:p>
     <w:p>
       <w:r>
-        <w:t>1. Latest released `linkoteq-structural-core` repository.</w:t>
+        <w:t xml:space="preserve">1. Latest released </w:t>
+      </w:r>
+      <w:r>
+        <w:rPr>
+          <w:rFonts w:ascii="Consolas" w:hAnsi="Consolas"/>
+          <w:sz w:val="18"/>
+        </w:rPr>
+        <w:t>linkoteq-structural-core</w:t>
+      </w:r>
+      <w:r>
+        <w:t xml:space="preserve"> repository.</w:t>
       </w:r>
     </w:p>
     <w:p>
@@ -349,7 +398,17 @@
     </w:p>
     <w:p>
       <w:r>
-        <w:t>6. `project-status.json`, handoff records, CI and deployment evidence.</w:t>
+        <w:t xml:space="preserve">6. </w:t>
+      </w:r>
+      <w:r>
+        <w:rPr>
+          <w:rFonts w:ascii="Consolas" w:hAnsi="Consolas"/>
+          <w:sz w:val="18"/>
+        </w:rPr>
+        <w:t>project-status.json</w:t>
+      </w:r>
+      <w:r>
+        <w:t>, handoff records, CI and deployment evidence.</w:t>
       </w:r>
     </w:p>
     <w:p>
@@ -367,7 +426,7 @@
         <w:pStyle w:val="Heading2"/>
       </w:pPr>
       <w:r>
-        <w:t>Core v0.4 baseline</w:t>
+        <w:t>Coordinate baseline retained in Core v0.5</w:t>
       </w:r>
     </w:p>
     <w:p>
@@ -422,16 +481,32 @@
       <w:pPr>
         <w:pStyle w:val="ListBullet"/>
       </w:pPr>
-      <w:r>
-        <w:t>`x` is measured from member start along local +x.</w:t>
+      <w:r/>
+      <w:r>
+        <w:rPr>
+          <w:rFonts w:ascii="Consolas" w:hAnsi="Consolas"/>
+          <w:sz w:val="18"/>
+        </w:rPr>
+        <w:t>x</w:t>
+      </w:r>
+      <w:r>
+        <w:t xml:space="preserve"> is measured from member start along local +x.</w:t>
       </w:r>
     </w:p>
     <w:p>
       <w:pPr>
         <w:pStyle w:val="ListBullet"/>
       </w:pPr>
-      <w:r>
-        <w:t>`xRatio` is optional normalized position.</w:t>
+      <w:r/>
+      <w:r>
+        <w:rPr>
+          <w:rFonts w:ascii="Consolas" w:hAnsi="Consolas"/>
+          <w:sz w:val="18"/>
+        </w:rPr>
+        <w:t>xRatio</w:t>
+      </w:r>
+      <w:r>
+        <w:t xml:space="preserve"> is optional normalized position.</w:t>
       </w:r>
     </w:p>
     <w:p>
@@ -452,7 +527,17 @@
     </w:p>
     <w:p>
       <w:r>
-        <w:t>Every active calculator/tool should have `project-status.json` in its repository.</w:t>
+        <w:t xml:space="preserve">Every active calculator/tool should have </w:t>
+      </w:r>
+      <w:r>
+        <w:rPr>
+          <w:rFonts w:ascii="Consolas" w:hAnsi="Consolas"/>
+          <w:sz w:val="18"/>
+        </w:rPr>
+        <w:t>project-status.json</w:t>
+      </w:r>
+      <w:r>
+        <w:t xml:space="preserve"> in its repository.</w:t>
       </w:r>
     </w:p>
     <w:p>
@@ -510,7 +595,17 @@
     </w:p>
     <w:p>
       <w:r>
-        <w:t>If `project-status.json` is missing or stale, GPT-4 should reconstruct the status from repository/CI/deployment evidence and then update or recommend updating the status record.</w:t>
+        <w:t xml:space="preserve">If </w:t>
+      </w:r>
+      <w:r>
+        <w:rPr>
+          <w:rFonts w:ascii="Consolas" w:hAnsi="Consolas"/>
+          <w:sz w:val="18"/>
+        </w:rPr>
+        <w:t>project-status.json</w:t>
+      </w:r>
+      <w:r>
+        <w:t xml:space="preserve"> is missing or stale, GPT-4 should reconstruct the status from repository/CI/deployment evidence and then update or recommend updating the status record.</w:t>
       </w:r>
     </w:p>
     <w:p>
@@ -535,25 +630,43 @@
       <w:pPr>
         <w:pStyle w:val="ListBullet"/>
       </w:pPr>
-      <w:r>
-        <w:t>`handoffs/gpt1-to-gpt2.md`</w:t>
-      </w:r>
+      <w:r/>
+      <w:r>
+        <w:rPr>
+          <w:rFonts w:ascii="Consolas" w:hAnsi="Consolas"/>
+          <w:sz w:val="18"/>
+        </w:rPr>
+        <w:t>handoffs/gpt1-to-gpt2.md</w:t>
+      </w:r>
+      <w:r/>
     </w:p>
     <w:p>
       <w:pPr>
         <w:pStyle w:val="ListBullet"/>
       </w:pPr>
-      <w:r>
-        <w:t>`handoffs/gpt2-to-gpt3.md`</w:t>
-      </w:r>
+      <w:r/>
+      <w:r>
+        <w:rPr>
+          <w:rFonts w:ascii="Consolas" w:hAnsi="Consolas"/>
+          <w:sz w:val="18"/>
+        </w:rPr>
+        <w:t>handoffs/gpt2-to-gpt3.md</w:t>
+      </w:r>
+      <w:r/>
     </w:p>
     <w:p>
       <w:pPr>
         <w:pStyle w:val="ListBullet"/>
       </w:pPr>
-      <w:r>
-        <w:t>`handoffs/gpt3-to-gpt4.md`</w:t>
-      </w:r>
+      <w:r/>
+      <w:r>
+        <w:rPr>
+          <w:rFonts w:ascii="Consolas" w:hAnsi="Consolas"/>
+          <w:sz w:val="18"/>
+        </w:rPr>
+        <w:t>handoffs/gpt3-to-gpt4.md</w:t>
+      </w:r>
+      <w:r/>
     </w:p>
     <w:p>
       <w:r>
@@ -983,11 +1096,6 @@
       </w:r>
     </w:p>
     <w:p>
-      <w:r>
-        <w:br w:type="page"/>
-      </w:r>
-    </w:p>
-    <w:p>
       <w:pPr>
         <w:pStyle w:val="Heading1"/>
       </w:pPr>
@@ -1023,7 +1131,17 @@
     </w:p>
     <w:p>
       <w:r>
-        <w:t>2. read `project-status.json` if present;</w:t>
+        <w:t xml:space="preserve">2. read </w:t>
+      </w:r>
+      <w:r>
+        <w:rPr>
+          <w:rFonts w:ascii="Consolas" w:hAnsi="Consolas"/>
+          <w:sz w:val="18"/>
+        </w:rPr>
+        <w:t>project-status.json</w:t>
+      </w:r>
+      <w:r>
+        <w:t xml:space="preserve"> if present;</w:t>
       </w:r>
     </w:p>
     <w:p>
@@ -1121,49 +1239,85 @@
       <w:pPr>
         <w:pStyle w:val="ListBullet"/>
       </w:pPr>
-      <w:r>
-        <w:t>`not-started`</w:t>
-      </w:r>
+      <w:r/>
+      <w:r>
+        <w:rPr>
+          <w:rFonts w:ascii="Consolas" w:hAnsi="Consolas"/>
+          <w:sz w:val="18"/>
+        </w:rPr>
+        <w:t>not-started</w:t>
+      </w:r>
+      <w:r/>
     </w:p>
     <w:p>
       <w:pPr>
         <w:pStyle w:val="ListBullet"/>
       </w:pPr>
-      <w:r>
-        <w:t>`in-progress`</w:t>
-      </w:r>
+      <w:r/>
+      <w:r>
+        <w:rPr>
+          <w:rFonts w:ascii="Consolas" w:hAnsi="Consolas"/>
+          <w:sz w:val="18"/>
+        </w:rPr>
+        <w:t>in-progress</w:t>
+      </w:r>
+      <w:r/>
     </w:p>
     <w:p>
       <w:pPr>
         <w:pStyle w:val="ListBullet"/>
       </w:pPr>
-      <w:r>
-        <w:t>`blocked`</w:t>
-      </w:r>
+      <w:r/>
+      <w:r>
+        <w:rPr>
+          <w:rFonts w:ascii="Consolas" w:hAnsi="Consolas"/>
+          <w:sz w:val="18"/>
+        </w:rPr>
+        <w:t>blocked</w:t>
+      </w:r>
+      <w:r/>
     </w:p>
     <w:p>
       <w:pPr>
         <w:pStyle w:val="ListBullet"/>
       </w:pPr>
-      <w:r>
-        <w:t>`ready-for-next-stage`</w:t>
-      </w:r>
+      <w:r/>
+      <w:r>
+        <w:rPr>
+          <w:rFonts w:ascii="Consolas" w:hAnsi="Consolas"/>
+          <w:sz w:val="18"/>
+        </w:rPr>
+        <w:t>ready-for-next-stage</w:t>
+      </w:r>
+      <w:r/>
     </w:p>
     <w:p>
       <w:pPr>
         <w:pStyle w:val="ListBullet"/>
       </w:pPr>
-      <w:r>
-        <w:t>`complete`</w:t>
-      </w:r>
+      <w:r/>
+      <w:r>
+        <w:rPr>
+          <w:rFonts w:ascii="Consolas" w:hAnsi="Consolas"/>
+          <w:sz w:val="18"/>
+        </w:rPr>
+        <w:t>complete</w:t>
+      </w:r>
+      <w:r/>
     </w:p>
     <w:p>
       <w:pPr>
         <w:pStyle w:val="ListBullet"/>
       </w:pPr>
-      <w:r>
-        <w:t>`superseded`</w:t>
-      </w:r>
+      <w:r/>
+      <w:r>
+        <w:rPr>
+          <w:rFonts w:ascii="Consolas" w:hAnsi="Consolas"/>
+          <w:sz w:val="18"/>
+        </w:rPr>
+        <w:t>superseded</w:t>
+      </w:r>
+      <w:r/>
     </w:p>
     <w:p>
       <w:pPr>
@@ -1238,9 +1392,15 @@
       <w:pPr>
         <w:pStyle w:val="ListBullet"/>
       </w:pPr>
-      <w:r>
-        <w:t>`handoffs/gpt1-to-gpt2.md`</w:t>
-      </w:r>
+      <w:r/>
+      <w:r>
+        <w:rPr>
+          <w:rFonts w:ascii="Consolas" w:hAnsi="Consolas"/>
+          <w:sz w:val="18"/>
+        </w:rPr>
+        <w:t>handoffs/gpt1-to-gpt2.md</w:t>
+      </w:r>
+      <w:r/>
     </w:p>
     <w:p>
       <w:pPr>
@@ -1299,9 +1459,15 @@
       <w:pPr>
         <w:pStyle w:val="ListBullet"/>
       </w:pPr>
-      <w:r>
-        <w:t>`handoffs/gpt2-to-gpt3.md`</w:t>
-      </w:r>
+      <w:r/>
+      <w:r>
+        <w:rPr>
+          <w:rFonts w:ascii="Consolas" w:hAnsi="Consolas"/>
+          <w:sz w:val="18"/>
+        </w:rPr>
+        <w:t>handoffs/gpt2-to-gpt3.md</w:t>
+      </w:r>
+      <w:r/>
     </w:p>
     <w:p>
       <w:pPr>
@@ -1368,9 +1534,15 @@
       <w:pPr>
         <w:pStyle w:val="ListBullet"/>
       </w:pPr>
-      <w:r>
-        <w:t>`handoffs/gpt3-to-gpt4.md`</w:t>
-      </w:r>
+      <w:r/>
+      <w:r>
+        <w:rPr>
+          <w:rFonts w:ascii="Consolas" w:hAnsi="Consolas"/>
+          <w:sz w:val="18"/>
+        </w:rPr>
+        <w:t>handoffs/gpt3-to-gpt4.md</w:t>
+      </w:r>
+      <w:r/>
     </w:p>
     <w:p>
       <w:pPr>
@@ -1469,8 +1641,16 @@
     </w:p>
     <w:p>
       <w:r>
-        <w:t>Recommended file: `project-status.json`</w:t>
-      </w:r>
+        <w:t xml:space="preserve">Recommended file: </w:t>
+      </w:r>
+      <w:r>
+        <w:rPr>
+          <w:rFonts w:ascii="Consolas" w:hAnsi="Consolas"/>
+          <w:sz w:val="18"/>
+        </w:rPr>
+        <w:t>project-status.json</w:t>
+      </w:r>
+      <w:r/>
     </w:p>
     <w:p>
       <w:r>
@@ -1683,41 +1863,71 @@
       <w:pPr>
         <w:pStyle w:val="ListBullet"/>
       </w:pPr>
-      <w:r>
-        <w:t>`compliant`</w:t>
-      </w:r>
+      <w:r/>
+      <w:r>
+        <w:rPr>
+          <w:rFonts w:ascii="Consolas" w:hAnsi="Consolas"/>
+          <w:sz w:val="18"/>
+        </w:rPr>
+        <w:t>compliant</w:t>
+      </w:r>
+      <w:r/>
     </w:p>
     <w:p>
       <w:pPr>
         <w:pStyle w:val="ListBullet"/>
       </w:pPr>
-      <w:r>
-        <w:t>`compliant-with-compatibility-layer`</w:t>
-      </w:r>
+      <w:r/>
+      <w:r>
+        <w:rPr>
+          <w:rFonts w:ascii="Consolas" w:hAnsi="Consolas"/>
+          <w:sz w:val="18"/>
+        </w:rPr>
+        <w:t>compliant-with-compatibility-layer</w:t>
+      </w:r>
+      <w:r/>
     </w:p>
     <w:p>
       <w:pPr>
         <w:pStyle w:val="ListBullet"/>
       </w:pPr>
-      <w:r>
-        <w:t>`migration-required`</w:t>
-      </w:r>
+      <w:r/>
+      <w:r>
+        <w:rPr>
+          <w:rFonts w:ascii="Consolas" w:hAnsi="Consolas"/>
+          <w:sz w:val="18"/>
+        </w:rPr>
+        <w:t>migration-required</w:t>
+      </w:r>
+      <w:r/>
     </w:p>
     <w:p>
       <w:pPr>
         <w:pStyle w:val="ListBullet"/>
       </w:pPr>
-      <w:r>
-        <w:t>`blocked`</w:t>
-      </w:r>
+      <w:r/>
+      <w:r>
+        <w:rPr>
+          <w:rFonts w:ascii="Consolas" w:hAnsi="Consolas"/>
+          <w:sz w:val="18"/>
+        </w:rPr>
+        <w:t>blocked</w:t>
+      </w:r>
+      <w:r/>
     </w:p>
     <w:p>
       <w:pPr>
         <w:pStyle w:val="ListBullet"/>
       </w:pPr>
-      <w:r>
-        <w:t>`unknown-unverified`</w:t>
-      </w:r>
+      <w:r/>
+      <w:r>
+        <w:rPr>
+          <w:rFonts w:ascii="Consolas" w:hAnsi="Consolas"/>
+          <w:sz w:val="18"/>
+        </w:rPr>
+        <w:t>unknown-unverified</w:t>
+      </w:r>
+      <w:r/>
     </w:p>
     <w:p>
       <w:pPr>
@@ -1856,7 +2066,17 @@
     </w:p>
     <w:p>
       <w:r>
-        <w:t>Do not mark `production-ready` until:</w:t>
+        <w:t xml:space="preserve">Do not mark </w:t>
+      </w:r>
+      <w:r>
+        <w:rPr>
+          <w:rFonts w:ascii="Consolas" w:hAnsi="Consolas"/>
+          <w:sz w:val="18"/>
+        </w:rPr>
+        <w:t>production-ready</w:t>
+      </w:r>
+      <w:r>
+        <w:t xml:space="preserve"> until:</w:t>
       </w:r>
     </w:p>
     <w:p>
@@ -1955,11 +2175,6 @@
       </w:r>
     </w:p>
     <w:p>
-      <w:r>
-        <w:br w:type="page"/>
-      </w:r>
-    </w:p>
-    <w:p>
       <w:pPr>
         <w:pStyle w:val="Heading1"/>
       </w:pPr>
@@ -1980,58 +2195,143 @@
         <w:pStyle w:val="Heading2"/>
       </w:pPr>
       <w:r>
-        <w:t>Core static Knowledge to upload to GPT-4</w:t>
-      </w:r>
-    </w:p>
-    <w:p>
-      <w:r>
-        <w:t>1. `GPT4_MASTER_INSTRUCTIONS.md`</w:t>
-      </w:r>
-    </w:p>
-    <w:p>
-      <w:r>
-        <w:t>2. `GPT4_OPERATIONS_HANDBOOK.md`</w:t>
-      </w:r>
-    </w:p>
-    <w:p>
-      <w:r>
-        <w:t>3. `CORE_CONTRACT.md`</w:t>
-      </w:r>
-    </w:p>
-    <w:p>
-      <w:r>
-        <w:t>4. `typescript/index.ts`</w:t>
-      </w:r>
-    </w:p>
-    <w:p>
-      <w:r>
-        <w:t>5. `AI_GPT_UPDATE_POLICY.md`</w:t>
-      </w:r>
-    </w:p>
-    <w:p>
-      <w:r>
-        <w:t>6. `GPT1_SPEC_RULES_v0.4.md`</w:t>
-      </w:r>
-    </w:p>
-    <w:p>
-      <w:r>
-        <w:t>7. `GPT2_IMPLEMENTATION_RULES_v0.4.md`</w:t>
-      </w:r>
-    </w:p>
-    <w:p>
-      <w:r>
-        <w:t>8. `GPT3_INTEGRATION_RELEASE_RULES_v0.4.md`</w:t>
-      </w:r>
-    </w:p>
-    <w:p>
-      <w:r>
-        <w:t>9. `CALCULATOR_RELEASE_CHECKLIST_v0.4.md`</w:t>
-      </w:r>
-    </w:p>
-    <w:p>
-      <w:r>
-        <w:t>10. `LinkoTech_Project_Summary.docx`</w:t>
-      </w:r>
+        <w:t>Historical static Knowledge inventory</w:t>
+      </w:r>
+    </w:p>
+    <w:p>
+      <w:r>
+        <w:t>This inventory is retained for provenance. Versioned v0.4 files and the project summary are historical context only; use the canonical current knowledge manifest for required runtime sources.</w:t>
+      </w:r>
+    </w:p>
+    <w:p>
+      <w:r>
+        <w:t xml:space="preserve">1. </w:t>
+      </w:r>
+      <w:r>
+        <w:rPr>
+          <w:rFonts w:ascii="Consolas" w:hAnsi="Consolas"/>
+          <w:sz w:val="18"/>
+        </w:rPr>
+        <w:t>GPT4_MASTER_INSTRUCTIONS.md</w:t>
+      </w:r>
+      <w:r/>
+    </w:p>
+    <w:p>
+      <w:r>
+        <w:t xml:space="preserve">2. </w:t>
+      </w:r>
+      <w:r>
+        <w:rPr>
+          <w:rFonts w:ascii="Consolas" w:hAnsi="Consolas"/>
+          <w:sz w:val="18"/>
+        </w:rPr>
+        <w:t>GPT4_OPERATIONS_HANDBOOK.md</w:t>
+      </w:r>
+      <w:r/>
+    </w:p>
+    <w:p>
+      <w:r>
+        <w:t xml:space="preserve">3. </w:t>
+      </w:r>
+      <w:r>
+        <w:rPr>
+          <w:rFonts w:ascii="Consolas" w:hAnsi="Consolas"/>
+          <w:sz w:val="18"/>
+        </w:rPr>
+        <w:t>CORE_CONTRACT.md</w:t>
+      </w:r>
+      <w:r/>
+    </w:p>
+    <w:p>
+      <w:r>
+        <w:t xml:space="preserve">4. </w:t>
+      </w:r>
+      <w:r>
+        <w:rPr>
+          <w:rFonts w:ascii="Consolas" w:hAnsi="Consolas"/>
+          <w:sz w:val="18"/>
+        </w:rPr>
+        <w:t>typescript/index.ts</w:t>
+      </w:r>
+      <w:r/>
+    </w:p>
+    <w:p>
+      <w:r>
+        <w:t xml:space="preserve">5. </w:t>
+      </w:r>
+      <w:r>
+        <w:rPr>
+          <w:rFonts w:ascii="Consolas" w:hAnsi="Consolas"/>
+          <w:sz w:val="18"/>
+        </w:rPr>
+        <w:t>AI_GPT_UPDATE_POLICY.md</w:t>
+      </w:r>
+      <w:r/>
+    </w:p>
+    <w:p>
+      <w:r>
+        <w:t xml:space="preserve">6. </w:t>
+      </w:r>
+      <w:r>
+        <w:rPr>
+          <w:rFonts w:ascii="Consolas" w:hAnsi="Consolas"/>
+          <w:sz w:val="18"/>
+        </w:rPr>
+        <w:t>GPT1_SPEC_RULES_v0.4.md</w:t>
+      </w:r>
+      <w:r/>
+    </w:p>
+    <w:p>
+      <w:r>
+        <w:t xml:space="preserve">7. </w:t>
+      </w:r>
+      <w:r>
+        <w:rPr>
+          <w:rFonts w:ascii="Consolas" w:hAnsi="Consolas"/>
+          <w:sz w:val="18"/>
+        </w:rPr>
+        <w:t>GPT2_IMPLEMENTATION_RULES_v0.4.md</w:t>
+      </w:r>
+      <w:r/>
+    </w:p>
+    <w:p>
+      <w:r>
+        <w:t xml:space="preserve">8. </w:t>
+      </w:r>
+      <w:r>
+        <w:rPr>
+          <w:rFonts w:ascii="Consolas" w:hAnsi="Consolas"/>
+          <w:sz w:val="18"/>
+        </w:rPr>
+        <w:t>GPT3_INTEGRATION_RELEASE_RULES_v0.4.md</w:t>
+      </w:r>
+      <w:r/>
+    </w:p>
+    <w:p>
+      <w:r>
+        <w:t xml:space="preserve">9. </w:t>
+      </w:r>
+      <w:r>
+        <w:rPr>
+          <w:rFonts w:ascii="Consolas" w:hAnsi="Consolas"/>
+          <w:sz w:val="18"/>
+        </w:rPr>
+        <w:t>CALCULATOR_RELEASE_CHECKLIST_v0.4.md</w:t>
+      </w:r>
+      <w:r/>
+    </w:p>
+    <w:p>
+      <w:r>
+        <w:t xml:space="preserve">10. </w:t>
+      </w:r>
+      <w:r>
+        <w:rPr>
+          <w:rFonts w:ascii="Consolas" w:hAnsi="Consolas"/>
+          <w:sz w:val="18"/>
+        </w:rPr>
+        <w:t>LinkoTech_Project_Summary.docx</w:t>
+      </w:r>
+      <w:r/>
     </w:p>
     <w:p>
       <w:pPr>
@@ -2151,33 +2451,57 @@
       <w:pPr>
         <w:pStyle w:val="ListBullet"/>
       </w:pPr>
-      <w:r>
-        <w:t>`project-status.json`</w:t>
-      </w:r>
+      <w:r/>
+      <w:r>
+        <w:rPr>
+          <w:rFonts w:ascii="Consolas" w:hAnsi="Consolas"/>
+          <w:sz w:val="18"/>
+        </w:rPr>
+        <w:t>project-status.json</w:t>
+      </w:r>
+      <w:r/>
     </w:p>
     <w:p>
       <w:pPr>
         <w:pStyle w:val="ListBullet"/>
       </w:pPr>
-      <w:r>
-        <w:t>`handoffs/gpt1-to-gpt2.md`</w:t>
-      </w:r>
+      <w:r/>
+      <w:r>
+        <w:rPr>
+          <w:rFonts w:ascii="Consolas" w:hAnsi="Consolas"/>
+          <w:sz w:val="18"/>
+        </w:rPr>
+        <w:t>handoffs/gpt1-to-gpt2.md</w:t>
+      </w:r>
+      <w:r/>
     </w:p>
     <w:p>
       <w:pPr>
         <w:pStyle w:val="ListBullet"/>
       </w:pPr>
-      <w:r>
-        <w:t>`handoffs/gpt2-to-gpt3.md`</w:t>
-      </w:r>
+      <w:r/>
+      <w:r>
+        <w:rPr>
+          <w:rFonts w:ascii="Consolas" w:hAnsi="Consolas"/>
+          <w:sz w:val="18"/>
+        </w:rPr>
+        <w:t>handoffs/gpt2-to-gpt3.md</w:t>
+      </w:r>
+      <w:r/>
     </w:p>
     <w:p>
       <w:pPr>
         <w:pStyle w:val="ListBullet"/>
       </w:pPr>
-      <w:r>
-        <w:t>`handoffs/gpt3-to-gpt4.md`</w:t>
-      </w:r>
+      <w:r/>
+      <w:r>
+        <w:rPr>
+          <w:rFonts w:ascii="Consolas" w:hAnsi="Consolas"/>
+          <w:sz w:val="18"/>
+        </w:rPr>
+        <w:t>handoffs/gpt3-to-gpt4.md</w:t>
+      </w:r>
+      <w:r/>
     </w:p>
     <w:p>
       <w:pPr>
@@ -2229,14 +2553,321 @@
         <w:t>runtime project state must come from GitHub, not stale uploaded Knowledge.</w:t>
       </w:r>
     </w:p>
+    <w:p>
+      <w:pPr>
+        <w:pStyle w:val="Heading1"/>
+      </w:pPr>
+      <w:r>
+        <w:t>Seven agent operating requirements</w:t>
+      </w:r>
+    </w:p>
+    <w:p>
+      <w:pPr>
+        <w:pStyle w:val="Heading1"/>
+      </w:pPr>
+      <w:r>
+        <w:t>Active Core v0.5 integration</w:t>
+      </w:r>
+    </w:p>
+    <w:p>
+      <w:r>
+        <w:t xml:space="preserve">Read </w:t>
+      </w:r>
+      <w:r>
+        <w:rPr>
+          <w:rFonts w:ascii="Consolas" w:hAnsi="Consolas"/>
+          <w:sz w:val="18"/>
+        </w:rPr>
+        <w:t>CORE_CONTRACT.md</w:t>
+      </w:r>
+      <w:r>
+        <w:t xml:space="preserve"> and </w:t>
+      </w:r>
+      <w:r>
+        <w:rPr>
+          <w:rFonts w:ascii="Consolas" w:hAnsi="Consolas"/>
+          <w:sz w:val="18"/>
+        </w:rPr>
+        <w:t>typescript/index.ts</w:t>
+      </w:r>
+      <w:r>
+        <w:t xml:space="preserve"> on </w:t>
+      </w:r>
+      <w:r>
+        <w:rPr>
+          <w:rFonts w:ascii="Consolas" w:hAnsi="Consolas"/>
+          <w:sz w:val="18"/>
+        </w:rPr>
+        <w:t>main</w:t>
+      </w:r>
+      <w:r>
+        <w:t xml:space="preserve"> before integrated work, and record the exact observed commit. Verify releases/tags separately; an observed main revision is not automatically a released baseline. If no release is available, record the conflict and obtain an explicitly approved pinned baseline before release claims.</w:t>
+      </w:r>
+    </w:p>
+    <w:p>
+      <w:r>
+        <w:t xml:space="preserve">Apply typed Material and Section analysis properties, six node DOFs, supports, support springs, enforced displacements, member releases, canonical load primitives, LoadCase/LoadSource provenance, algebraic load combinations, analysis modes and canonical node/member results. Preserve explicit dimensional units, stable IDs, right-handed local axes, result stations and </w:t>
+      </w:r>
+      <w:r>
+        <w:rPr>
+          <w:rFonts w:ascii="Consolas" w:hAnsi="Consolas"/>
+          <w:sz w:val="18"/>
+        </w:rPr>
+        <w:t>member-local-right-hand-v1</w:t>
+      </w:r>
+      <w:r>
+        <w:t xml:space="preserve"> signs. Unsupported mappings must produce explicit diagnostics; do not invent equivalent behavior.</w:t>
+      </w:r>
+    </w:p>
+    <w:p>
+      <w:r>
+        <w:t xml:space="preserve">All PyNite execution crosses the Core Analysis Adapter owned by GPT-2. GPT-3, GPT-4, GPT-6 and GPT-7 must not call PyNite directly or duplicate approved GPT-2 calculation logic. Solver-dependent integration remains gated by </w:t>
+      </w:r>
+      <w:r>
+        <w:rPr>
+          <w:rFonts w:ascii="Consolas" w:hAnsi="Consolas"/>
+          <w:sz w:val="18"/>
+        </w:rPr>
+        <w:t>orchestration/PYNITE_ADAPTER_VERIFICATION_GATE.md</w:t>
+      </w:r>
+      <w:r>
+        <w:t>: GPT-2 supplies implementation and test evidence; GPT-4 independently accepts it. Breaking contract changes reopen verification. Preserve standalone calculator behavior while migrating integration boundaries.</w:t>
+      </w:r>
+    </w:p>
+    <w:p>
+      <w:pPr>
+        <w:pStyle w:val="Heading1"/>
+      </w:pPr>
+      <w:r>
+        <w:t>GPT-5 security review and retest</w:t>
+      </w:r>
+    </w:p>
+    <w:p>
+      <w:r>
+        <w:t>GPT-4 opens a GitHub-traceable review for changes affecting authentication, sessions, entitlements, APIs, uploads, storage, AI/model access, CORS, callbacks or deployment security. The request identifies repository, exact commit, threat surface, scope, acceptance criteria and release stage.</w:t>
+      </w:r>
+    </w:p>
+    <w:p>
+      <w:r>
+        <w:t>GPT-5 records findings, severity, affected paths, evidence and required remediation. GPT-4 assigns fixes to implementation owners, records their commits and requests GPT-5 retest against the changed revision. Unresolved high/critical findings block release unless an authorized owner explicitly records a scoped, expiring risk acceptance with rationale and controls. GPT-4 cannot invent a GPT-5 verdict. Security approval is separate from engineering correctness and production verification.</w:t>
+      </w:r>
+    </w:p>
+    <w:p>
+      <w:pPr>
+        <w:pStyle w:val="Heading1"/>
+      </w:pPr>
+      <w:r>
+        <w:t>Detection and reconstruction boundary</w:t>
+      </w:r>
+    </w:p>
+    <w:p>
+      <w:r>
+        <w:t>GPT-7 hands off StructuralDetectionEvidence with source/document/page/region references, dataset and model versions, coordinate frame, confidence, evaluation and limitations. The term names the detection handoff contract; it is not a new canonical Core type. Use the owning repository's validated schema and record its version; missing contracts block promotion.</w:t>
+      </w:r>
+    </w:p>
+    <w:p>
+      <w:r>
+        <w:t>GPT-6 validates scale, coordinate transforms, geometry, connectivity, units, stable identity, provenance and human review before mapping eligible entities to StructuralModel. Keep observed, reconstructed and proposed origins distinct. Low-confidence or conflicting detections remain reviewable evidence; they must not silently become approved geometry. Proposed geometry must never become observed training ground truth without a separately reviewed annotation decision. Preserve source evidence and rejected/unsupported features.</w:t>
+      </w:r>
+    </w:p>
+    <w:p>
+      <w:r>
+        <w:t>GPT-4 coordinates the GPT-7 -&gt; GPT-6 -&gt; GPT-3 handoffs, GPT-1 semantic decisions, GPT-2 analysis eligibility and GPT-5 security review. Detection and reconstruction do not grant approval to solve a model or certify engineering equivalence.</w:t>
+      </w:r>
+    </w:p>
+    <w:p>
+      <w:pPr>
+        <w:pStyle w:val="Heading1"/>
+      </w:pPr>
+      <w:r>
+        <w:t>Seven-agent handoff extensions</w:t>
+      </w:r>
+    </w:p>
+    <w:p>
+      <w:r>
+        <w:t xml:space="preserve">Retain existing GPT-1/2/3 handoffs. Recommended additional project paths are </w:t>
+      </w:r>
+      <w:r>
+        <w:rPr>
+          <w:rFonts w:ascii="Consolas" w:hAnsi="Consolas"/>
+          <w:sz w:val="18"/>
+        </w:rPr>
+        <w:t>handoffs/gpt4-to-gpt5.md</w:t>
+      </w:r>
+      <w:r>
+        <w:t xml:space="preserve">, </w:t>
+      </w:r>
+      <w:r>
+        <w:rPr>
+          <w:rFonts w:ascii="Consolas" w:hAnsi="Consolas"/>
+          <w:sz w:val="18"/>
+        </w:rPr>
+        <w:t>handoffs/gpt5-to-gpt4.md</w:t>
+      </w:r>
+      <w:r>
+        <w:t xml:space="preserve">, </w:t>
+      </w:r>
+      <w:r>
+        <w:rPr>
+          <w:rFonts w:ascii="Consolas" w:hAnsi="Consolas"/>
+          <w:sz w:val="18"/>
+        </w:rPr>
+        <w:t>handoffs/gpt7-to-gpt6.md</w:t>
+      </w:r>
+      <w:r>
+        <w:t xml:space="preserve">, and </w:t>
+      </w:r>
+      <w:r>
+        <w:rPr>
+          <w:rFonts w:ascii="Consolas" w:hAnsi="Consolas"/>
+          <w:sz w:val="18"/>
+        </w:rPr>
+        <w:t>handoffs/gpt6-to-gpt3.md</w:t>
+      </w:r>
+      <w:r>
+        <w:t>; existing equivalent paths may be retained with an explicit index. Security retest records must identify both the finding revision and the remediation revision.</w:t>
+      </w:r>
+    </w:p>
+    <w:p>
+      <w:r>
+        <w:t>Each handoff records source/target owner, repository/path, exact source commit, Core and interface versions, deliverables, test commands and evidence, limitations, blockers, next actions and forbidden changes. Detection handoffs also record source/dataset/model versions and confidence. Reconstruction handoffs also record calibration, topology checks, provenance and review state. Security handoffs also record findings, severity, disposition, retest and any expiring risk acceptance.</w:t>
+      </w:r>
+    </w:p>
+    <w:p>
+      <w:r>
+        <w:t xml:space="preserve">Add security, detection, reconstruction and plugin-runtime evidence to project status where applicable; use </w:t>
+      </w:r>
+      <w:r>
+        <w:rPr>
+          <w:rFonts w:ascii="Consolas" w:hAnsi="Consolas"/>
+          <w:sz w:val="18"/>
+        </w:rPr>
+        <w:t>not-applicable</w:t>
+      </w:r>
+      <w:r>
+        <w:t xml:space="preserve"> only with a reason. Keep code changes, commit creation, main update, CI, deployment creation, deployment health, URL reachability and representative production behavior as separate facts with exact revisions. A handoff file does not automatically notify or execute another agent.</w:t>
+      </w:r>
+    </w:p>
+    <w:p>
+      <w:pPr>
+        <w:pStyle w:val="Heading1"/>
+      </w:pPr>
+      <w:r>
+        <w:t>Direct access and migration controls</w:t>
+      </w:r>
+    </w:p>
+    <w:p>
+      <w:r>
+        <w:t xml:space="preserve">Read </w:t>
+      </w:r>
+      <w:r>
+        <w:rPr>
+          <w:rFonts w:ascii="Consolas" w:hAnsi="Consolas"/>
+          <w:sz w:val="18"/>
+        </w:rPr>
+        <w:t>LINKOTEQ_PLUGIN_MIGRATION_CONTRACT.md</w:t>
+      </w:r>
+      <w:r>
+        <w:t xml:space="preserve">, </w:t>
+      </w:r>
+      <w:r>
+        <w:rPr>
+          <w:rFonts w:ascii="Consolas" w:hAnsi="Consolas"/>
+          <w:sz w:val="18"/>
+        </w:rPr>
+        <w:t>knowledge/gpt4/MULTI_AGENT_ORCHESTRATION_CONTRACT.md</w:t>
+      </w:r>
+      <w:r>
+        <w:t xml:space="preserve"> and </w:t>
+      </w:r>
+      <w:r>
+        <w:rPr>
+          <w:rFonts w:ascii="Consolas" w:hAnsi="Consolas"/>
+          <w:sz w:val="18"/>
+        </w:rPr>
+        <w:t>knowledge/gpt4/GPT4_PLUGIN_MIGRATION_RUNBOOK.md</w:t>
+      </w:r>
+      <w:r>
+        <w:t>. Use the Direct GitHub Connector only; no Gateway, proxy, separate approval service or credential storage fallback.</w:t>
+      </w:r>
+    </w:p>
+    <w:p>
+      <w:r>
+        <w:t>Follow the active authorized repository/branch scope. A cross-repository work order does not grant access. Verify actual host tools, authentication and repository permissions; report unavailable reads and pause dependent work. Read success, a manifest dependency and a saved plugin release do not prove write permission or runtime behavior in another host.</w:t>
+      </w:r>
+    </w:p>
+    <w:p>
+      <w:r>
+        <w:t>Before every repository mutation, prepare the full diff with repository, main branch, base commit, commit message, all paths/operations and binary before/after artifacts with hashes; obtain explicit user approval of that exact diff. Re-read the head/source SHAs; if the approved base or content changed, prepare a revised review. Use expected-head protection and non-force updates; read back the commit, changed paths and contents. Never write only as a connectivity test.</w:t>
+      </w:r>
+    </w:p>
+    <w:p>
+      <w:r>
+        <w:t>Update the existing GPT-4 plugin in place, preserving its ID, private audience, assets, prompts and valid role instructions. Keep the prior version/configuration as rollback evidence; do not delete or recreate the plugin. Repository documentation publication does not establish plugin configuration, saved release, installation, runtime permissions or production readiness.</w:t>
+      </w:r>
+    </w:p>
+    <w:p>
+      <w:pPr>
+        <w:pStyle w:val="Heading1"/>
+      </w:pPr>
+      <w:r>
+        <w:t>Current knowledge index and migration acceptance</w:t>
+      </w:r>
+    </w:p>
+    <w:p>
+      <w:r>
+        <w:t xml:space="preserve">Use </w:t>
+      </w:r>
+      <w:r>
+        <w:rPr>
+          <w:rFonts w:ascii="Consolas" w:hAnsi="Consolas"/>
+          <w:sz w:val="18"/>
+        </w:rPr>
+        <w:t>knowledge/gpt4/GPT4_KNOWLEDGE_MANIFEST.md</w:t>
+      </w:r>
+      <w:r>
+        <w:t xml:space="preserve"> for the current dependency index and </w:t>
+      </w:r>
+      <w:r>
+        <w:rPr>
+          <w:rFonts w:ascii="Consolas" w:hAnsi="Consolas"/>
+          <w:sz w:val="18"/>
+        </w:rPr>
+        <w:t>knowledge/gpt4/GPT4_PLUGIN_MIGRATION_TRACKING.md</w:t>
+      </w:r>
+      <w:r>
+        <w:t xml:space="preserve"> for evidence and remaining blockers. Preserve the Stage 0-5 application lifecycle; security is cross-cutting, and detection/reconstruction are conditional upstream workstreams. Do not renumber application stages to imply all agents must run on every task.</w:t>
+      </w:r>
+    </w:p>
+    <w:p>
+      <w:r>
+        <w:t>Synchronize this Markdown guide and its DOCX reading copy in the same reviewed change. Verify substantive text parity and render every DOCX page before publication. Record content hashes in the migration manifest. Guide synchronization does not complete plugin migration: inspect the existing plugin ID/configuration, update in place, verify private visibility and assets, test actual-host tools and authorized reads, conduct non-mutating scope/approval tests, obtain applicable GPT-5 review and record applicable CI. Keep deployment and production verification separate and unverified unless evidence exists.</w:t>
+      </w:r>
+    </w:p>
     <w:sectPr>
+      <w:footerReference w:type="default" r:id="rId9"/>
       <w:pgSz w:w="12240" w:h="15840"/>
-      <w:pgMar w:top="1440" w:right="1800" w:bottom="1440" w:left="1800" w:header="720" w:footer="720" w:gutter="0"/>
+      <w:pgMar w:top="936" w:right="1080" w:bottom="936" w:left="1080" w:header="720" w:footer="720" w:gutter="0"/>
       <w:cols w:space="720"/>
       <w:docGrid w:linePitch="360"/>
     </w:sectPr>
   </w:body>
 </w:document>
+</file>
+
+<file path=word/footer1.xml><?xml version="1.0" encoding="utf-8"?>
+<w:ftr xmlns:m="http://schemas.openxmlformats.org/officeDocument/2006/math" xmlns:mc="http://schemas.openxmlformats.org/markup-compatibility/2006" xmlns:mo="http://schemas.microsoft.com/office/mac/office/2008/main" xmlns:mv="urn:schemas-microsoft-com:mac:vml" xmlns:o="urn:schemas-microsoft-com:office:office" xmlns:r="http://schemas.openxmlformats.org/officeDocument/2006/relationships" xmlns:v="urn:schemas-microsoft-com:vml" xmlns:w10="urn:schemas-microsoft-com:office:word" xmlns:w14="http://schemas.microsoft.com/office/word/2010/wordml" xmlns:w="http://schemas.openxmlformats.org/wordprocessingml/2006/main" xmlns:wne="http://schemas.microsoft.com/office/word/2006/wordml" xmlns:wp14="http://schemas.microsoft.com/office/word/2010/wordprocessingDrawing" xmlns:wp="http://schemas.openxmlformats.org/drawingml/2006/wordprocessingDrawing" xmlns:wpc="http://schemas.microsoft.com/office/word/2010/wordprocessingCanvas" xmlns:wpg="http://schemas.microsoft.com/office/word/2010/wordprocessingGroup" xmlns:wpi="http://schemas.microsoft.com/office/word/2010/wordprocessingInk" xmlns:wps="http://schemas.microsoft.com/office/word/2010/wordprocessingShape" mc:Ignorable="w14 wp14">
+  <w:p>
+    <w:pPr>
+      <w:pStyle w:val="Footer"/>
+      <w:jc w:val="right"/>
+    </w:pPr>
+    <w:r>
+      <w:t xml:space="preserve">Linkoteq GPT-4  |  </w:t>
+    </w:r>
+    <w:fldSimple w:instr="PAGE"/>
+  </w:p>
+</w:ftr>
 </file>
 
 <file path=word/numbering.xml><?xml version="1.0" encoding="utf-8"?>
@@ -2602,9 +3233,12 @@
     <w:name w:val="Normal"/>
     <w:qFormat/>
     <w:rsid w:val="00FC693F"/>
+    <w:pPr>
+      <w:spacing w:after="80" w:line="250" w:lineRule="auto"/>
+    </w:pPr>
     <w:rPr>
-      <w:rFonts w:ascii="Arial" w:hAnsi="Arial"/>
-      <w:sz w:val="20"/>
+      <w:rFonts w:ascii="Calibri" w:hAnsi="Calibri"/>
+      <w:sz w:val="21"/>
     </w:rPr>
   </w:style>
   <w:style w:type="paragraph" w:styleId="Header">
@@ -2669,7 +3303,7 @@
       <w:rFonts w:asciiTheme="majorHAnsi" w:eastAsiaTheme="majorEastAsia" w:hAnsiTheme="majorHAnsi" w:cstheme="majorBidi"/>
       <w:b/>
       <w:bCs/>
-      <w:color w:val="365F91" w:themeColor="accent1" w:themeShade="BF"/>
+      <w:color w:val="000000"/>
       <w:sz w:val="28"/>
       <w:szCs w:val="28"/>
     </w:rPr>
@@ -2693,7 +3327,7 @@
       <w:rFonts w:asciiTheme="majorHAnsi" w:eastAsiaTheme="majorEastAsia" w:hAnsiTheme="majorHAnsi" w:cstheme="majorBidi"/>
       <w:b/>
       <w:bCs/>
-      <w:color w:val="4F81BD" w:themeColor="accent1"/>
+      <w:color w:val="000000"/>
       <w:sz w:val="26"/>
       <w:szCs w:val="26"/>
     </w:rPr>
@@ -2717,7 +3351,7 @@
       <w:rFonts w:asciiTheme="majorHAnsi" w:eastAsiaTheme="majorEastAsia" w:hAnsiTheme="majorHAnsi" w:cstheme="majorBidi"/>
       <w:b/>
       <w:bCs/>
-      <w:color w:val="4F81BD" w:themeColor="accent1"/>
+      <w:color w:val="000000"/>
     </w:rPr>
   </w:style>
   <w:style w:type="paragraph" w:styleId="Heading4">
@@ -2742,7 +3376,7 @@
       <w:bCs/>
       <w:i/>
       <w:iCs/>
-      <w:color w:val="4F81BD" w:themeColor="accent1"/>
+      <w:color w:val="000000"/>
     </w:rPr>
   </w:style>
   <w:style w:type="paragraph" w:styleId="Heading5">
@@ -2948,15 +3582,13 @@
     <w:qFormat/>
     <w:rsid w:val="00FC693F"/>
     <w:pPr>
-      <w:pBdr>
-        <w:bottom w:val="single" w:sz="8" w:space="4" w:color="4F81BD" w:themeColor="accent1"/>
-      </w:pBdr>
+      <w:keepNext/>
       <w:spacing w:after="300" w:line="240" w:lineRule="auto"/>
       <w:contextualSpacing/>
     </w:pPr>
     <w:rPr>
       <w:rFonts w:asciiTheme="majorHAnsi" w:eastAsiaTheme="majorEastAsia" w:hAnsiTheme="majorHAnsi" w:cstheme="majorBidi"/>
-      <w:color w:val="17365D" w:themeColor="text2" w:themeShade="BF"/>
+      <w:color w:val="000000"/>
       <w:spacing w:val="5"/>
       <w:kern w:val="28"/>
       <w:sz w:val="52"/>
@@ -3133,6 +3765,7 @@
       <w:numPr>
         <w:numId w:val="1"/>
       </w:numPr>
+      <w:spacing w:after="20"/>
       <w:contextualSpacing/>
     </w:pPr>
   </w:style>
@@ -3172,6 +3805,7 @@
       <w:numPr>
         <w:numId w:val="5"/>
       </w:numPr>
+      <w:spacing w:after="20"/>
       <w:contextualSpacing/>
     </w:pPr>
   </w:style>
@@ -3435,9 +4069,6 @@
     <w:qFormat/>
     <w:rsid w:val="00FC693F"/>
     <w:pPr>
-      <w:pBdr>
-        <w:bottom w:val="single" w:sz="4" w:space="4" w:color="4F81BD" w:themeColor="accent1"/>
-      </w:pBdr>
       <w:spacing w:before="200" w:after="280"/>
       <w:ind w:left="936" w:right="936"/>
     </w:pPr>

</xml_diff>